<commit_message>
The mark from the Imago itself: the IHS medallion of 1640
The Maltese cross gives way to a genuinely Jesuit device: the IHS
medallion from the breast of the Societas figure on the Imago primi
saeculi's engraved title (Antwerp 1640), already in the repository as
assets/imago/frontispiece.jpg. Cut as a round seal with a thin gold
ring (assets/imago-mark.png), it now serves as favicon, topbar mark
and the seal on the social card; provenance noted in the README.

The introduction essay's manuscript in docs/ is brought level with the
site: its anchor sentence now carries the corrected 2,464/1,768 count.

Co-Authored-By: Claude Fable 5 <noreply@anthropic.com>
</commit_message>
<xml_diff>
--- a/docs/Fassbender-2026-Ignatiana-Introduction.docx
+++ b/docs/Fassbender-2026-Ignatiana-Introduction.docx
@@ -2316,7 +2316,7 @@
           <w:sz w:val="24"/>
           <w:szCs w:val="24"/>
         </w:rPr>
-        <w:t xml:space="preserve"> and Mullan and validated for completeness, 370 of 370 in all three languages. On this grid rest 1,887 canonical anchors tying paragraph numbers to the pages on which they begin in the reference editions, so that a concordance hit reads </w:t>
+        <w:t xml:space="preserve"> and Mullan and validated for completeness, 370 of 370 in all three languages. On this grid rest the apparatus’s 2,464 canonical anchors: 1,768 tie paragraph numbers to the pages on which they begin in the locked reference editions, so that a concordance hit reads </w:t>
       </w:r>
       <w:r>
         <w:rPr>
@@ -2356,7 +2356,7 @@
           <w:sz w:val="24"/>
           <w:szCs w:val="24"/>
         </w:rPr>
-        <w:t xml:space="preserve"> [134] rather than a page number nobody cites. The anchor table is released as a public-domain dataset because a citation index that others cannot build on is of little use.</w:t>
+        <w:t xml:space="preserve"> [134] rather than a page number nobody cites, while the shipped editions carry their numbers paragraph by paragraph and need no page index. The anchor table is released as a public-domain dataset because a citation index that others cannot build on is of little use.</w:t>
       </w:r>
     </w:p>
     <w:p>

</xml_diff>